<commit_message>
Fix legacy linter errors: re-cite Tier 2 POC to POC-001/QUA-003/004/007 (ADR-003); linter skips rejection-marked lines
</commit_message>
<xml_diff>
--- a/Design/acrme_technical_design_document.docx
+++ b/Design/acrme_technical_design_document.docx
@@ -6778,7 +6778,7 @@
         <w:rPr>
           <w:rStyle w:val="VerbatimChar"/>
         </w:rPr>
-        <w:t xml:space="preserve">              + 0.25·Clamp(1 - prod_customer_count / total_customers)</w:t>
+        <w:t xml:space="preserve">              + 0.25·Clamp(1 - prod_customer_count / total_customers(g))</w:t>
       </w:r>
       <w:r>
         <w:br/>
@@ -6826,7 +6826,7 @@
         <w:rPr>
           <w:rStyle w:val="VerbatimChar"/>
         </w:rPr>
-        <w:t xml:space="preserve">              + 0.25·Clamp(1 - nonprod_customer_count / total_customers)</w:t>
+        <w:t xml:space="preserve">              + 0.25·Clamp(1 - nonprod_customer_count / total_customers(g))</w:t>
       </w:r>
       <w:r>
         <w:br/>
@@ -6874,7 +6874,7 @@
         <w:rPr>
           <w:rStyle w:val="VerbatimChar"/>
         </w:rPr>
-        <w:t xml:space="preserve">              + 0.25·Clamp(1 - dr_customer_count / total_customers)</w:t>
+        <w:t xml:space="preserve">              + 0.25·Clamp(1 - dr_customer_count / total_customers(g))</w:t>
       </w:r>
       <w:r>
         <w:br/>
@@ -6898,6 +6898,78 @@
     <w:p>
       <w:pPr>
         <w:pStyle w:val="FirstParagraph"/>
+      </w:pPr>
+      <w:r>
+        <w:rPr>
+          <w:bCs/>
+          <w:b/>
+        </w:rPr>
+        <w:t xml:space="preserve">γ denominator (PLC-012, A.10)</w:t>
+      </w:r>
+      <w:r>
+        <w:rPr>
+          <w:bCs/>
+          <w:b/>
+        </w:rPr>
+        <w:t xml:space="preserve"> </w:t>
+      </w:r>
+      <w:r>
+        <w:rPr>
+          <w:rStyle w:val="VerbatimChar"/>
+          <w:bCs/>
+          <w:b/>
+        </w:rPr>
+        <w:t xml:space="preserve">[Decided]</w:t>
+      </w:r>
+      <w:r>
+        <w:rPr>
+          <w:bCs/>
+          <w:b/>
+        </w:rPr>
+        <w:t xml:space="preserve">:</w:t>
+      </w:r>
+      <w:r>
+        <w:t xml:space="preserve"> </w:t>
+      </w:r>
+      <w:r>
+        <w:rPr>
+          <w:rStyle w:val="VerbatimChar"/>
+        </w:rPr>
+        <w:t xml:space="preserve">total_customers(g)</w:t>
+      </w:r>
+      <w:r>
+        <w:t xml:space="preserve"> </w:t>
+      </w:r>
+      <w:r>
+        <w:t xml:space="preserve">is the count of distinct customers with any environment (Prod, CVAL or DR) provisioned or being deployed in any region of the scored region’s geography</w:t>
+      </w:r>
+      <w:r>
+        <w:t xml:space="preserve"> </w:t>
+      </w:r>
+      <w:r>
+        <w:rPr>
+          <w:iCs/>
+          <w:i/>
+        </w:rPr>
+        <w:t xml:space="preserve">g</w:t>
+      </w:r>
+      <w:r>
+        <w:t xml:space="preserve">. It is one live count per geography, shared by all three scores.</w:t>
+      </w:r>
+      <w:r>
+        <w:t xml:space="preserve"> </w:t>
+      </w:r>
+      <w:r>
+        <w:rPr>
+          <w:bCs/>
+          <w:b/>
+        </w:rPr>
+        <w:t xml:space="preserve">γ = 1 when it is zero.</w:t>
+      </w:r>
+    </w:p>
+    <w:p>
+      <w:pPr>
+        <w:pStyle w:val="BodyText"/>
       </w:pPr>
       <w:r>
         <w:rPr>
@@ -10788,43 +10860,58 @@
               <w:jc w:val="left"/>
             </w:pPr>
             <w:r>
-              <w:t xml:space="preserve">POC-031/032</w:t>
-            </w:r>
-          </w:p>
-        </w:tc>
-        <w:tc>
-          <w:tcPr/>
-          <w:p>
-            <w:pPr>
-              <w:pStyle w:val="Compact"/>
-              <w:jc w:val="left"/>
-            </w:pPr>
-            <w:r>
-              <w:t xml:space="preserve">Tier 2 quota-neutral transfer within a group/pool</w:t>
-            </w:r>
-          </w:p>
-        </w:tc>
-        <w:tc>
-          <w:tcPr/>
-          <w:p>
-            <w:pPr>
-              <w:pStyle w:val="Compact"/>
-              <w:jc w:val="left"/>
-            </w:pPr>
-            <w:r>
-              <w:t xml:space="preserve">Section 13 baseline Tier 2</w:t>
-            </w:r>
-          </w:p>
-        </w:tc>
-        <w:tc>
-          <w:tcPr/>
-          <w:p>
-            <w:pPr>
-              <w:pStyle w:val="Compact"/>
-              <w:jc w:val="left"/>
-            </w:pPr>
-            <w:r>
-              <w:t xml:space="preserve">Required</w:t>
+              <w:t xml:space="preserve">POC-001 (Tier 2 use)</w:t>
+            </w:r>
+          </w:p>
+        </w:tc>
+        <w:tc>
+          <w:tcPr/>
+          <w:p>
+            <w:pPr>
+              <w:pStyle w:val="Compact"/>
+              <w:jc w:val="left"/>
+            </w:pPr>
+            <w:r>
+              <w:t xml:space="preserve">Tier 2 quota-neutral transfer within the single pool: after a Quota Group transfer, does the deploying (consumer) subscription hold enough VM-family and total regional vCPU? (QUA-003, QUA-004, QUA-007)</w:t>
+            </w:r>
+          </w:p>
+        </w:tc>
+        <w:tc>
+          <w:tcPr/>
+          <w:p>
+            <w:pPr>
+              <w:pStyle w:val="Compact"/>
+              <w:jc w:val="left"/>
+            </w:pPr>
+            <w:r>
+              <w:t xml:space="preserve">ADR-003</w:t>
+            </w:r>
+            <w:r>
+              <w:t xml:space="preserve"> </w:t>
+            </w:r>
+            <w:r>
+              <w:t xml:space="preserve">“</w:t>
+            </w:r>
+            <w:r>
+              <w:t xml:space="preserve">Relationship to Emergency Tiers</w:t>
+            </w:r>
+            <w:r>
+              <w:t xml:space="preserve">”</w:t>
+            </w:r>
+            <w:r>
+              <w:t xml:space="preserve">; Section 9 Tier 2</w:t>
+            </w:r>
+          </w:p>
+        </w:tc>
+        <w:tc>
+          <w:tcPr/>
+          <w:p>
+            <w:pPr>
+              <w:pStyle w:val="Compact"/>
+              <w:jc w:val="left"/>
+            </w:pPr>
+            <w:r>
+              <w:t xml:space="preserve">Required — Tier 2 stays approval-gated until proven (ADR-003)</w:t>
             </w:r>
           </w:p>
         </w:tc>

</xml_diff>